<commit_message>
Notes from unit-3 to unit-6
</commit_message>
<xml_diff>
--- a/Notes/Unit-2 Strings.docx
+++ b/Notes/Unit-2 Strings.docx
@@ -219,6 +219,7 @@
           <w:rFonts w:ascii="Times New Roman" w:hAnsi="Times New Roman" w:cs="Times New Roman"/>
           <w:b/>
           <w:bCs/>
+          <w:noProof/>
           <w:sz w:val="44"/>
           <w:szCs w:val="44"/>
           <w:u w:val="single"/>
@@ -432,6 +433,15 @@
           <w:szCs w:val="44"/>
         </w:rPr>
         <w:lastRenderedPageBreak/>
+        <w:t xml:space="preserve"> </w:t>
+      </w:r>
+      <w:r>
+        <w:rPr>
+          <w:rFonts w:ascii="Times New Roman" w:hAnsi="Times New Roman" w:cs="Times New Roman"/>
+          <w:noProof/>
+          <w:sz w:val="44"/>
+          <w:szCs w:val="44"/>
+        </w:rPr>
         <w:drawing>
           <wp:inline distT="0" distB="0" distL="0" distR="0" wp14:anchorId="0D226B2B" wp14:editId="3DC9B3E3">
             <wp:extent cx="5731510" cy="4215765"/>

</xml_diff>